<commit_message>
docs: update beginner guide to v2.6 (characters, relationships, candidate re-improvisation, two-layer eval, chars command, 人物 tab)
</commit_message>
<xml_diff>
--- a/docs/JazzWriter_新手引导.docx
+++ b/docs/JazzWriter_新手引导.docx
@@ -38,7 +38,7 @@
           <w:color w:val="999999"/>
           <w:sz w:val="22"/>
         </w:rPr>
-        <w:t>适用版本 v2.5　·　Novel Jazz Engine</w:t>
+        <w:t>适用版本 v2.6　·　Novel Jazz Engine</w:t>
       </w:r>
     </w:p>
     <w:p/>
@@ -87,7 +87,7 @@
         <w:pStyle w:val="ListBullet"/>
       </w:pPr>
       <w:r>
-        <w:t>五、核心概念：乐谱与结构</w:t>
+        <w:t>五、核心概念：乐谱 · 结构 · 人物与关系</w:t>
       </w:r>
     </w:p>
     <w:p>
@@ -159,7 +159,7 @@
         <w:rPr>
           <w:b w:val="0"/>
         </w:rPr>
-        <w:t>JazzWriter 不是“一键生成整本小说”的工具，而是一个帮你探索故事的“即兴引擎”。它的主要产物是：故事方案、全书梗概、分卷结构与逐章摘要卡片。正文生成是可选的“局部演练”。</w:t>
+        <w:t>JazzWriter 不是“一键生成整本小说”的工具，而是一个帮你探索故事的“即兴引擎”。它的主要产物是：故事方案、全书梗概、分卷结构、逐章摘要卡片，以及人物与关系网络。正文生成是可选的“局部演练”。</w:t>
       </w:r>
     </w:p>
     <w:p>
@@ -167,7 +167,7 @@
         <w:rPr>
           <w:b/>
         </w:rPr>
-        <w:t>工作循环可以记成一句话：</w:t>
+        <w:t>工作循环一句话：</w:t>
       </w:r>
     </w:p>
     <w:p>
@@ -175,7 +175,7 @@
         <w:rPr>
           <w:b w:val="0"/>
         </w:rPr>
-        <w:t>给定一个前提 → 发散出多个实质不同的故事方向 → 采纳或融合 → 生成完整结构（分卷+逐章卡片）→ 校验 → 局部重新即兴 → 导出。最后由你来判断与选择。</w:t>
+        <w:t>给定一个前提 → 发散出多个实质不同的故事方向 → 采纳或融合 → 生成完整结构（梗概+分卷+逐章卡片）→ 校验 → 局部重新即兴（先出候选）→ 导出。最后由你判断与选择。</w:t>
       </w:r>
     </w:p>
     <w:p>
@@ -183,7 +183,7 @@
         <w:rPr>
           <w:b w:val="0"/>
         </w:rPr>
-        <w:t>它适合：长篇小说/网文/系列的作者、需要管理世界观与伏笔的写作者、想先想清楚“故事怎么成立”的人。</w:t>
+        <w:t>它适合：长篇小说/网文/系列的作者、需要管理人物与伏笔的写作者、想先想清楚“故事怎么成立”的人。</w:t>
       </w:r>
     </w:p>
     <w:p>
@@ -303,7 +303,7 @@
         <w:rPr>
           <w:b w:val="0"/>
         </w:rPr>
-        <w:t>并设置：即兴模式（classic_jazz / bebop / free_jazz）、全书章数、结构模板（如 mystery 悬疑）。</w:t>
+        <w:t>并设置：即兴模式、全书章数、结构模板（如 mystery 悬疑）。</w:t>
       </w:r>
     </w:p>
     <w:p>
@@ -319,7 +319,7 @@
         <w:rPr>
           <w:b w:val="0"/>
         </w:rPr>
-        <w:t>点「生成创意方案」→ 右侧「创意候选」标签页会出现多个方向。每个方向在“因果机制 / 真相性质 / 人物关系 / 结局方向”上实质不同。</w:t>
+        <w:t>点「生成创意方案」→ 右侧「创意候选」标签页出现多个方向。每个方向在“因果机制 / 真相性质 / 人物关系 / 结局方向”上实质不同。</w:t>
       </w:r>
     </w:p>
     <w:p>
@@ -335,7 +335,7 @@
         <w:rPr>
           <w:b w:val="0"/>
         </w:rPr>
-        <w:t>在“采纳方案#”里选一个编号；也可以点「融合所选两个方案」把两个方向合并成一个新方向。然后点「采纳并展开全书结构」。</w:t>
+        <w:t>在“采纳方案#”里选一个编号；也可点「融合所选两个方案」把两个方向合并。然后点「采纳并展开全书结构」。</w:t>
       </w:r>
     </w:p>
     <w:p>
@@ -351,7 +351,15 @@
         <w:rPr>
           <w:b w:val="0"/>
         </w:rPr>
-        <w:t>右侧「全书结构 / 结构树 / 章节卡片」展示分卷与逐章摘要。点「校验结构」查看问题清单（硬问题 + 叙事审阅），问题优先于分数。</w:t>
+        <w:t>右侧「全书结构 / 结构树 / 章节卡片 / 人物」展示分卷、逐章摘要与人物使用情况。点「校验结构」查看问题清单——**先列问题，再列参考分数**。</w:t>
+      </w:r>
+    </w:p>
+    <w:p>
+      <w:r>
+        <w:rPr>
+          <w:b w:val="0"/>
+        </w:rPr>
+        <w:t>校验分两层：结构硬校验（缺章/编号/断链/未回收线索/闲置人物）+ 叙事审阅（事件是否合理、人物选择是否成立、结局是否回应开篇，给出依据与章号）。</w:t>
       </w:r>
     </w:p>
     <w:p>
@@ -367,7 +375,15 @@
         <w:rPr>
           <w:b w:val="0"/>
         </w:rPr>
-        <w:t>在「结构树」选中某一章 →「章节卡片」可直接编辑 →点「保存章节卡片编辑」。认可的情节可「锁定」（整章锁定或字段级锁定）；想改某章时点「重新即兴选中章」：系统先给出候选，你采纳后才写回，未选中的章节与锁定内容不受影响。</w:t>
+        <w:t>在「结构树」选中一章 →「章节卡片」可直接编辑 →点「保存章节卡片编辑」。认可的情节可「锁定」（整章锁定或字段级锁定）。</w:t>
+      </w:r>
+    </w:p>
+    <w:p>
+      <w:r>
+        <w:rPr>
+          <w:b w:val="0"/>
+        </w:rPr>
+        <w:t>想改某章时点「重新即兴选中章」：系统**先给出候选**（显示改动字段），你**采纳后才写回**；未选中的章节与锁定内容不受影响。</w:t>
       </w:r>
     </w:p>
     <w:p>
@@ -392,6 +408,128 @@
       </w:pPr>
       <w:r>
         <w:t>四、界面速览</w:t>
+      </w:r>
+    </w:p>
+    <w:p>
+      <w:pPr>
+        <w:pStyle w:val="Heading2"/>
+      </w:pPr>
+      <w:r>
+        <w:t>顶部工具栏</w:t>
+      </w:r>
+    </w:p>
+    <w:tbl>
+      <w:tblPr>
+        <w:tblStyle w:val="TableGrid"/>
+        <w:tblW w:type="auto" w:w="0"/>
+        <w:tblLook w:firstColumn="1" w:firstRow="1" w:lastColumn="0" w:lastRow="0" w:noHBand="0" w:noVBand="1" w:val="04A0"/>
+      </w:tblPr>
+      <w:tblGrid>
+        <w:gridCol w:w="4320"/>
+        <w:gridCol w:w="4320"/>
+      </w:tblGrid>
+      <w:tr>
+        <w:tc>
+          <w:tcPr>
+            <w:tcW w:type="dxa" w:w="4320"/>
+          </w:tcPr>
+          <w:p>
+            <w:r>
+              <w:rPr>
+                <w:b/>
+              </w:rPr>
+              <w:t>控件</w:t>
+            </w:r>
+          </w:p>
+        </w:tc>
+        <w:tc>
+          <w:tcPr>
+            <w:tcW w:type="dxa" w:w="4320"/>
+          </w:tcPr>
+          <w:p>
+            <w:r>
+              <w:rPr>
+                <w:b/>
+              </w:rPr>
+              <w:t>说明</w:t>
+            </w:r>
+          </w:p>
+        </w:tc>
+      </w:tr>
+      <w:tr>
+        <w:tc>
+          <w:tcPr>
+            <w:tcW w:type="dxa" w:w="4320"/>
+          </w:tcPr>
+          <w:p>
+            <w:r>
+              <w:t>模型</w:t>
+            </w:r>
+          </w:p>
+        </w:tc>
+        <w:tc>
+          <w:tcPr>
+            <w:tcW w:type="dxa" w:w="4320"/>
+          </w:tcPr>
+          <w:p>
+            <w:r>
+              <w:t>mock（离线演示）/ opencode（复用你已连接的模型）/ openai（兼容端点）</w:t>
+            </w:r>
+          </w:p>
+        </w:tc>
+      </w:tr>
+      <w:tr>
+        <w:tc>
+          <w:tcPr>
+            <w:tcW w:type="dxa" w:w="4320"/>
+          </w:tcPr>
+          <w:p>
+            <w:r>
+              <w:t>评价</w:t>
+            </w:r>
+          </w:p>
+        </w:tc>
+        <w:tc>
+          <w:tcPr>
+            <w:tcW w:type="dxa" w:w="4320"/>
+          </w:tcPr>
+          <w:p>
+            <w:r>
+              <w:t>文本相似度算法：lexical（默认、无依赖）/ embedding / hybrid；改后点“重载设定”</w:t>
+            </w:r>
+          </w:p>
+        </w:tc>
+      </w:tr>
+      <w:tr>
+        <w:tc>
+          <w:tcPr>
+            <w:tcW w:type="dxa" w:w="4320"/>
+          </w:tcPr>
+          <w:p>
+            <w:r>
+              <w:t>重载设定</w:t>
+            </w:r>
+          </w:p>
+        </w:tc>
+        <w:tc>
+          <w:tcPr>
+            <w:tcW w:type="dxa" w:w="4320"/>
+          </w:tcPr>
+          <w:p>
+            <w:r>
+              <w:t>使模型/评价模式/数据文件的改动生效</w:t>
+            </w:r>
+          </w:p>
+        </w:tc>
+      </w:tr>
+    </w:tbl>
+    <w:p/>
+    <w:p>
+      <w:pPr>
+        <w:pStyle w:val="Heading2"/>
+      </w:pPr>
+      <w:r>
+        <w:t>左侧控制区</w:t>
       </w:r>
     </w:p>
     <w:tbl>
@@ -439,7 +577,7 @@
           </w:tcPr>
           <w:p>
             <w:r>
-              <w:t>左侧 场景框</w:t>
+              <w:t>场景 / 章节摘要框</w:t>
             </w:r>
           </w:p>
         </w:tc>
@@ -461,7 +599,7 @@
           </w:tcPr>
           <w:p>
             <w:r>
-              <w:t>即兴模式 / 视角 / Solo 色彩</w:t>
+              <w:t>即兴模式 / 视角 POV / Solo 色彩</w:t>
             </w:r>
           </w:p>
         </w:tc>
@@ -505,7 +643,7 @@
           </w:tcPr>
           <w:p>
             <w:r>
-              <w:t>全书章数 / 采纳方案#</w:t>
+              <w:t>全书章数 / 采纳方案# / 融合方案A#、B#</w:t>
             </w:r>
           </w:p>
         </w:tc>
@@ -515,7 +653,7 @@
           </w:tcPr>
           <w:p>
             <w:r>
-              <w:t>期望章数与采纳的候选编号</w:t>
+              <w:t>期望章数与候选编号</w:t>
             </w:r>
           </w:p>
         </w:tc>
@@ -537,7 +675,7 @@
           </w:tcPr>
           <w:p>
             <w:r>
-              <w:t>控制创意发散、延迟揭露、连续性等</w:t>
+              <w:t>创意发散、因果变化、延迟揭露、连续性等</w:t>
             </w:r>
           </w:p>
         </w:tc>
@@ -559,7 +697,7 @@
           </w:tcPr>
           <w:p>
             <w:r>
-              <w:t>生成创意 / 融合 / 采纳展开 / 校验 / 卡片编辑 / 重新即兴 / 导出 / 偏离检测 / 故事板</w:t>
+              <w:t>生成创意 / 融合 / 采纳展开 / 校验 / 卡片编辑 / 重新即兴 / 锁定 / 导出 / 偏离检测 / 故事板</w:t>
             </w:r>
           </w:p>
         </w:tc>
@@ -582,6 +720,54 @@
           <w:p>
             <w:r>
               <w:t>按结构渲染正文 / 试写一章 / 多版本探索 / 场景建议 / Jam Session</w:t>
+            </w:r>
+          </w:p>
+        </w:tc>
+      </w:tr>
+    </w:tbl>
+    <w:p/>
+    <w:p>
+      <w:pPr>
+        <w:pStyle w:val="Heading2"/>
+      </w:pPr>
+      <w:r>
+        <w:t>右侧标签页</w:t>
+      </w:r>
+    </w:p>
+    <w:tbl>
+      <w:tblPr>
+        <w:tblStyle w:val="TableGrid"/>
+        <w:tblW w:type="auto" w:w="0"/>
+        <w:tblLook w:firstColumn="1" w:firstRow="1" w:lastColumn="0" w:lastRow="0" w:noHBand="0" w:noVBand="1" w:val="04A0"/>
+      </w:tblPr>
+      <w:tblGrid>
+        <w:gridCol w:w="4320"/>
+        <w:gridCol w:w="4320"/>
+      </w:tblGrid>
+      <w:tr>
+        <w:tc>
+          <w:tcPr>
+            <w:tcW w:type="dxa" w:w="4320"/>
+          </w:tcPr>
+          <w:p>
+            <w:r>
+              <w:rPr>
+                <w:b/>
+              </w:rPr>
+              <w:t>标签</w:t>
+            </w:r>
+          </w:p>
+        </w:tc>
+        <w:tc>
+          <w:tcPr>
+            <w:tcW w:type="dxa" w:w="4320"/>
+          </w:tcPr>
+          <w:p>
+            <w:r>
+              <w:rPr>
+                <w:b/>
+              </w:rPr>
+              <w:t>内容</w:t>
             </w:r>
           </w:p>
         </w:tc>
@@ -659,6 +845,28 @@
           </w:tcPr>
           <w:p>
             <w:r>
+              <w:t>人物</w:t>
+            </w:r>
+          </w:p>
+        </w:tc>
+        <w:tc>
+          <w:tcPr>
+            <w:tcW w:type="dxa" w:w="4320"/>
+          </w:tcPr>
+          <w:p>
+            <w:r>
+              <w:t>人物库、使用情况（参与章）、关系网络、闲置提示</w:t>
+            </w:r>
+          </w:p>
+        </w:tc>
+      </w:tr>
+      <w:tr>
+        <w:tc>
+          <w:tcPr>
+            <w:tcW w:type="dxa" w:w="4320"/>
+          </w:tcPr>
+          <w:p>
+            <w:r>
               <w:t>Jam</w:t>
             </w:r>
           </w:p>
@@ -681,7 +889,7 @@
           </w:tcPr>
           <w:p>
             <w:r>
-              <w:t>评价</w:t>
+              <w:t>正文</w:t>
             </w:r>
           </w:p>
         </w:tc>
@@ -691,7 +899,7 @@
           </w:tcPr>
           <w:p>
             <w:r>
-              <w:t>结构校验 + 叙事审阅 + 参考分数（问题优先）</w:t>
+              <w:t>按结构渲染或试写的正文</w:t>
             </w:r>
           </w:p>
         </w:tc>
@@ -703,7 +911,7 @@
           </w:tcPr>
           <w:p>
             <w:r>
-              <w:t>历史</w:t>
+              <w:t>即兴决策 / 评价 / 建议</w:t>
             </w:r>
           </w:p>
         </w:tc>
@@ -713,7 +921,29 @@
           </w:tcPr>
           <w:p>
             <w:r>
-              <w:t>每次运行的记录与趋势</w:t>
+              <w:t>本轮 Cue / 文本评价 / 下一轮建议</w:t>
+            </w:r>
+          </w:p>
+        </w:tc>
+      </w:tr>
+      <w:tr>
+        <w:tc>
+          <w:tcPr>
+            <w:tcW w:type="dxa" w:w="4320"/>
+          </w:tcPr>
+          <w:p>
+            <w:r>
+              <w:t>状态 / 历史</w:t>
+            </w:r>
+          </w:p>
+        </w:tc>
+        <w:tc>
+          <w:tcPr>
+            <w:tcW w:type="dxa" w:w="4320"/>
+          </w:tcPr>
+          <w:p>
+            <w:r>
+              <w:t>乐谱与故事状态 / 运行记录与趋势</w:t>
             </w:r>
           </w:p>
         </w:tc>
@@ -725,7 +955,7 @@
         <w:pStyle w:val="Heading1"/>
       </w:pPr>
       <w:r>
-        <w:t>五、核心概念：乐谱与结构</w:t>
+        <w:t>五、核心概念：乐谱 · 结构 · 人物与关系</w:t>
       </w:r>
     </w:p>
     <w:p>
@@ -821,7 +1051,29 @@
           </w:tcPr>
           <w:p>
             <w:r>
-              <w:t>人物（欲望/恐惧/记忆/世界观/矛盾/语感/即兴规则/人物弧）</w:t>
+              <w:t>人物库：id/层级/是否可作 POV + 叙事驱动字段</w:t>
+            </w:r>
+          </w:p>
+        </w:tc>
+      </w:tr>
+      <w:tr>
+        <w:tc>
+          <w:tcPr>
+            <w:tcW w:type="dxa" w:w="4320"/>
+          </w:tcPr>
+          <w:p>
+            <w:r>
+              <w:t>relationships.yaml</w:t>
+            </w:r>
+          </w:p>
+        </w:tc>
+        <w:tc>
+          <w:tcPr>
+            <w:tcW w:type="dxa" w:w="4320"/>
+          </w:tcPr>
+          <w:p>
+            <w:r>
+              <w:t>人物关系网络：需要 / 冲突 / 不对称 / 压力点 / 可能走向</w:t>
             </w:r>
           </w:p>
         </w:tc>
@@ -843,7 +1095,7 @@
           </w:tcPr>
           <w:p>
             <w:r>
-              <w:t>核心意象定义</w:t>
+              <w:t>意象定义（运行时意义演变写入 motif_state.yaml）</w:t>
             </w:r>
           </w:p>
         </w:tc>
@@ -865,7 +1117,7 @@
           </w:tcPr>
           <w:p>
             <w:r>
-              <w:t>故事圣经：已确定事实 / 怀疑 / 秘密 / 未决线索 / 近期事件</w:t>
+              <w:t>故事圣经：事实 / 怀疑 / 秘密 / 未决线索 / 近期事件</w:t>
             </w:r>
           </w:p>
         </w:tc>
@@ -885,7 +1137,7 @@
         <w:pStyle w:val="ListBullet"/>
       </w:pPr>
       <w:r>
-        <w:t>BookPlan（全书）：梗概、命题、冲突、关键转折、结局、分卷</w:t>
+        <w:t>BookPlan（全书）：梗概、命题、冲突、关键转折、高潮、结局、分卷、人物 ids</w:t>
       </w:r>
     </w:p>
     <w:p>
@@ -901,7 +1153,63 @@
         <w:pStyle w:val="ListBullet"/>
       </w:pPr>
       <w:r>
-        <w:t>ChapterPlan（章节卡片）：功能、POV、起因、行动、冲突、结果、信息变化、人物变化、线索、意象、前后钩子</w:t>
+        <w:t>ChapterPlan（章节卡片）：功能、POV、起因、行动、冲突、结果、信息变化、人物变化、线索、意象、前后钩子，以及人物参与（参与人物 / 关键决定 / 认知变化）</w:t>
+      </w:r>
+    </w:p>
+    <w:p>
+      <w:pPr>
+        <w:pStyle w:val="Heading2"/>
+      </w:pPr>
+      <w:r>
+        <w:t>人物与关系网络</w:t>
+      </w:r>
+    </w:p>
+    <w:p>
+      <w:r>
+        <w:rPr>
+          <w:b w:val="0"/>
+        </w:rPr>
+        <w:t>人物数量不设上限，按层级管理（示例给了 5 人）：</w:t>
+      </w:r>
+    </w:p>
+    <w:p>
+      <w:pPr>
+        <w:pStyle w:val="ListBullet"/>
+      </w:pPr>
+      <w:r>
+        <w:t>core 核心（2–4）：决定主线走向</w:t>
+      </w:r>
+    </w:p>
+    <w:p>
+      <w:pPr>
+        <w:pStyle w:val="ListBullet"/>
+      </w:pPr>
+      <w:r>
+        <w:t>supporting 重要配角（3–6）：握信息、代表不同利益、或有支线</w:t>
+      </w:r>
+    </w:p>
+    <w:p>
+      <w:pPr>
+        <w:pStyle w:val="ListBullet"/>
+      </w:pPr>
+      <w:r>
+        <w:t>functional 功能性人物（按需）：证人、办事人员等，不必都有完整弧线</w:t>
+      </w:r>
+    </w:p>
+    <w:p>
+      <w:r>
+        <w:rPr>
+          <w:b w:val="0"/>
+        </w:rPr>
+        <w:t>关键人物字段：id（稳定标识）、tier（层级）、pov（能否当视角）、desire / fear（欲望与恐惧）、blind_spots（认知局限，会在何处误判）、secrets（隐瞒）、capabilities / constraints（能做 / 受限）、current_goal（当下目标）。</w:t>
+      </w:r>
+    </w:p>
+    <w:p>
+      <w:r>
+        <w:rPr>
+          <w:b w:val="0"/>
+        </w:rPr>
+        <w:t>关系网络比继续给人加形容词更重要：它决定“谁必须合作、谁可能互相阻碍、一个人的选择如何代价化另一个人”。</w:t>
       </w:r>
     </w:p>
     <w:p>
@@ -949,7 +1257,7 @@
         <w:pStyle w:val="ListNumber"/>
       </w:pPr>
       <w:r>
-        <w:t>生成创意方案（故事级发散）。</w:t>
+        <w:t>生成创意方案（故事级发散；会把人物的欲望/盲点与关系网络一并纳入）。</w:t>
       </w:r>
     </w:p>
     <w:p>
@@ -957,7 +1265,7 @@
         <w:pStyle w:val="ListNumber"/>
       </w:pPr>
       <w:r>
-        <w:t>比较方案（因果机制/真相/关系/结局/差异度），可融合，也可标记过期（前提改了会提示）。</w:t>
+        <w:t>比较方案（因果机制/真相/关系/结局/差异度），可融合；前提改了会提示方案过期。</w:t>
       </w:r>
     </w:p>
     <w:p>
@@ -965,7 +1273,7 @@
         <w:pStyle w:val="ListNumber"/>
       </w:pPr>
       <w:r>
-        <w:t>采纳并展开：生成全书梗概（开端/触发事件/关键转折/高潮/结局处理）与逐章卡片。</w:t>
+        <w:t>采纳并展开：生成全书梗概（开端/触发事件/关键转折/高潮/结局处理）与逐章卡片；人物按层级分配到各章。</w:t>
       </w:r>
     </w:p>
     <w:p>
@@ -973,7 +1281,7 @@
         <w:pStyle w:val="ListNumber"/>
       </w:pPr>
       <w:r>
-        <w:t>校验：结构硬校验（缺章、编号、断链、未回收线索）+ 叙事审阅（含依据与章号）。</w:t>
+        <w:t>校验：结构硬校验（缺章、编号、断链、未回收线索、闲置人物）+ 叙事审阅（含依据与章号）。</w:t>
       </w:r>
     </w:p>
     <w:p>
@@ -1061,7 +1369,7 @@
         <w:rPr>
           <w:b w:val="0"/>
         </w:rPr>
-        <w:t>点「Jam Session（导演/独奏/观察/编辑）」：四个角色分工协作，Editor 会对候选打分排序、剔除与已知事实冲突者，整合成一个场景提案（不自动升级为正式设定）。</w:t>
+        <w:t>点「Jam Session（导演/独奏/观察/编辑）」：四角色分工协作，Editor 会对候选打分排序、剔除与已知事实冲突者，整合成一个场景提案（不自动升级为正式设定）。</w:t>
       </w:r>
     </w:p>
     <w:p>
@@ -1173,7 +1481,7 @@
         <w:rPr>
           <w:b w:val="0"/>
         </w:rPr>
-        <w:t>提示：结构生成在离线（mock）下使用确定性模板，会被明确标记为 offline_template；只有接入模型时才是模型创作。</w:t>
+        <w:t>提示：结构在离线（mock）下用确定性模板，会被标记为 offline_template；只有接入模型才是模型创作。</w:t>
       </w:r>
     </w:p>
     <w:p>
@@ -1251,6 +1559,28 @@
           </w:tcPr>
           <w:p>
             <w:r>
+              <w:t>python main.py chars</w:t>
+            </w:r>
+          </w:p>
+        </w:tc>
+        <w:tc>
+          <w:tcPr>
+            <w:tcW w:type="dxa" w:w="4320"/>
+          </w:tcPr>
+          <w:p>
+            <w:r>
+              <w:t>查看人物库、使用情况与关系网络</w:t>
+            </w:r>
+          </w:p>
+        </w:tc>
+      </w:tr>
+      <w:tr>
+        <w:tc>
+          <w:tcPr>
+            <w:tcW w:type="dxa" w:w="4320"/>
+          </w:tcPr>
+          <w:p>
+            <w:r>
               <w:t>python main.py outline "前提" --branches 3</w:t>
             </w:r>
           </w:p>
@@ -1273,6 +1603,28 @@
           </w:tcPr>
           <w:p>
             <w:r>
+              <w:t>python main.py outline "前提" --fuse 1 2</w:t>
+            </w:r>
+          </w:p>
+        </w:tc>
+        <w:tc>
+          <w:tcPr>
+            <w:tcW w:type="dxa" w:w="4320"/>
+          </w:tcPr>
+          <w:p>
+            <w:r>
+              <w:t>融合两个方案</w:t>
+            </w:r>
+          </w:p>
+        </w:tc>
+      </w:tr>
+      <w:tr>
+        <w:tc>
+          <w:tcPr>
+            <w:tcW w:type="dxa" w:w="4320"/>
+          </w:tcPr>
+          <w:p>
+            <w:r>
               <w:t>python main.py outline "前提" --build --pick 2 --chapters 12 --template mystery</w:t>
             </w:r>
           </w:p>
@@ -1284,28 +1636,6 @@
           <w:p>
             <w:r>
               <w:t>采纳并展开结构</w:t>
-            </w:r>
-          </w:p>
-        </w:tc>
-      </w:tr>
-      <w:tr>
-        <w:tc>
-          <w:tcPr>
-            <w:tcW w:type="dxa" w:w="4320"/>
-          </w:tcPr>
-          <w:p>
-            <w:r>
-              <w:t>python main.py outline "前提" --fuse 1 2</w:t>
-            </w:r>
-          </w:p>
-        </w:tc>
-        <w:tc>
-          <w:tcPr>
-            <w:tcW w:type="dxa" w:w="4320"/>
-          </w:tcPr>
-          <w:p>
-            <w:r>
-              <w:t>融合两个方案</w:t>
             </w:r>
           </w:p>
         </w:tc>
@@ -1371,7 +1701,7 @@
           </w:tcPr>
           <w:p>
             <w:r>
-              <w:t>锁定第 3 章 conflict 字段</w:t>
+              <w:t>锁定第 3 章的 conflict 字段</w:t>
             </w:r>
           </w:p>
         </w:tc>
@@ -1569,7 +1899,7 @@
           </w:tcPr>
           <w:p>
             <w:r>
-              <w:t>写入示例乐谱</w:t>
+              <w:t>写入示例乐谱（含人物与关系）</w:t>
             </w:r>
           </w:p>
         </w:tc>
@@ -1597,7 +1927,7 @@
         <w:rPr>
           <w:b w:val="0"/>
         </w:rPr>
-        <w:t>答：那是在用离线 mock。请接入真实模型（opencode 或 openai），结构创意与文笔主要依赖模型。</w:t>
+        <w:t>答：那是在用离线 mock。请接入真实模型（opencode 或 openai），结构与文笔主要依赖模型。</w:t>
       </w:r>
     </w:p>
     <w:p>
@@ -1614,6 +1944,38 @@
           <w:b w:val="0"/>
         </w:rPr>
         <w:t>答：离线 mock 不需要；真实模型需要。</w:t>
+      </w:r>
+    </w:p>
+    <w:p>
+      <w:r>
+        <w:rPr>
+          <w:b/>
+        </w:rPr>
+        <w:t>问：人物只能有几个？能加吗？</w:t>
+      </w:r>
+    </w:p>
+    <w:p>
+      <w:r>
+        <w:rPr>
+          <w:b w:val="0"/>
+        </w:rPr>
+        <w:t>答：不设上限。直接编辑 data/characters.yaml 增加人物即可；用 tier 分层、pov 决定能否当视角、约定 id 便于引用。短篇 2–3 人即可，群像可更多。</w:t>
+      </w:r>
+    </w:p>
+    <w:p>
+      <w:r>
+        <w:rPr>
+          <w:b/>
+        </w:rPr>
+        <w:t>问：关系网络有什么用？</w:t>
+      </w:r>
+    </w:p>
+    <w:p>
+      <w:r>
+        <w:rPr>
+          <w:b w:val="0"/>
+        </w:rPr>
+        <w:t>答：它让人物之间产生真实的合作与冲突，是故事动力来源。编辑 data/relationships.yaml 即可。用 python main.py chars 或 GUI「人物」页查看。</w:t>
       </w:r>
     </w:p>
     <w:p>
@@ -1669,22 +2031,6 @@
         <w:rPr>
           <w:b/>
         </w:rPr>
-        <w:t>问：支持多少章？</w:t>
-      </w:r>
-    </w:p>
-    <w:p>
-      <w:r>
-        <w:rPr>
-          <w:b w:val="0"/>
-        </w:rPr>
-        <w:t>答：结构模式可到几十上百章；耗时与质量取决于模型。</w:t>
-      </w:r>
-    </w:p>
-    <w:p>
-      <w:r>
-        <w:rPr>
-          <w:b/>
-        </w:rPr>
         <w:t>问：支持哪些模型？</w:t>
       </w:r>
     </w:p>
@@ -1717,7 +2063,7 @@
         <w:rPr>
           <w:b/>
         </w:rPr>
-        <w:t>问：结构生成失败/章数不对？</w:t>
+        <w:t>问：看到“人物未参与任何章节”？</w:t>
       </w:r>
     </w:p>
     <w:p>
@@ -1725,7 +2071,7 @@
         <w:rPr>
           <w:b w:val="0"/>
         </w:rPr>
-        <w:t>答：分阶段生成会严格校验章数；不满足则自动回退并标记为离线模板，不会静默接受。</w:t>
+        <w:t>答：这是人物使用检查：登记了却没在结构里出现。可增加其戏份，或降低其层级/暂不使用。</w:t>
       </w:r>
     </w:p>
     <w:p>
@@ -1791,7 +2137,7 @@
           </w:tcPr>
           <w:p>
             <w:r>
-              <w:t>乐谱：主题、人物、意象、故事状态（可编辑）</w:t>
+              <w:t>乐谱：主题、人物、关系、意象、故事状态（可编辑）</w:t>
             </w:r>
           </w:p>
         </w:tc>
@@ -2049,6 +2395,72 @@
           </w:tcPr>
           <w:p>
             <w:r>
+              <w:t>Character 人物</w:t>
+            </w:r>
+          </w:p>
+        </w:tc>
+        <w:tc>
+          <w:tcPr>
+            <w:tcW w:type="dxa" w:w="4320"/>
+          </w:tcPr>
+          <w:p>
+            <w:r>
+              <w:t>含 id/层级/视角资格与叙事驱动字段（欲望/恐惧/盲点/秘密/能力/限制/目标）</w:t>
+            </w:r>
+          </w:p>
+        </w:tc>
+      </w:tr>
+      <w:tr>
+        <w:tc>
+          <w:tcPr>
+            <w:tcW w:type="dxa" w:w="4320"/>
+          </w:tcPr>
+          <w:p>
+            <w:r>
+              <w:t>Relationship 关系</w:t>
+            </w:r>
+          </w:p>
+        </w:tc>
+        <w:tc>
+          <w:tcPr>
+            <w:tcW w:type="dxa" w:w="4320"/>
+          </w:tcPr>
+          <w:p>
+            <w:r>
+              <w:t>人物之间的需要、冲突、不对称与可能走向</w:t>
+            </w:r>
+          </w:p>
+        </w:tc>
+      </w:tr>
+      <w:tr>
+        <w:tc>
+          <w:tcPr>
+            <w:tcW w:type="dxa" w:w="4320"/>
+          </w:tcPr>
+          <w:p>
+            <w:r>
+              <w:t>tier 层级</w:t>
+            </w:r>
+          </w:p>
+        </w:tc>
+        <w:tc>
+          <w:tcPr>
+            <w:tcW w:type="dxa" w:w="4320"/>
+          </w:tcPr>
+          <w:p>
+            <w:r>
+              <w:t>core 核心 / supporting 重要配角 / functional 功能性</w:t>
+            </w:r>
+          </w:p>
+        </w:tc>
+      </w:tr>
+      <w:tr>
+        <w:tc>
+          <w:tcPr>
+            <w:tcW w:type="dxa" w:w="4320"/>
+          </w:tcPr>
+          <w:p>
+            <w:r>
               <w:t>Cue 乐谱</w:t>
             </w:r>
           </w:p>
@@ -2104,28 +2516,6 @@
           <w:p>
             <w:r>
               <w:t>全书 / 分卷 / 章节卡片三层结构</w:t>
-            </w:r>
-          </w:p>
-        </w:tc>
-      </w:tr>
-      <w:tr>
-        <w:tc>
-          <w:tcPr>
-            <w:tcW w:type="dxa" w:w="4320"/>
-          </w:tcPr>
-          <w:p>
-            <w:r>
-              <w:t>ImprovisationOperator</w:t>
-            </w:r>
-          </w:p>
-        </w:tc>
-        <w:tc>
-          <w:tcPr>
-            <w:tcW w:type="dxa" w:w="4320"/>
-          </w:tcPr>
-          <w:p>
-            <w:r>
-              <w:t>注意力转移、信息错位、因果重审等叙事操作</w:t>
             </w:r>
           </w:p>
         </w:tc>

</xml_diff>

<commit_message>
v2.7: per-chapter relationship changes + relationship continuity validation
- outline_expander: turning-point chapters emit relationship_changes (pair/change/cause) from relationships.yaml (pressure_point/possible_transition)
- BookPlanner LLM volume prompt includes relationship network + relationship_changes schema; _chapter_from_dict parses it
- plot_validator(relationships): undefined-pair changes, missing cause, defined-relationship-never-changes, unknown character ids
- StructureEvaluator/Session.validate_book pass relationships; Session.relationship_changes_view; CLI 'chars' shows changes per relationship
- tests/test_v27.py (6); beginner guide regenerated to v2.7; 64 tests
</commit_message>
<xml_diff>
--- a/docs/JazzWriter_新手引导.docx
+++ b/docs/JazzWriter_新手引导.docx
@@ -38,7 +38,7 @@
           <w:color w:val="999999"/>
           <w:sz w:val="22"/>
         </w:rPr>
-        <w:t>适用版本 v2.6　·　Novel Jazz Engine</w:t>
+        <w:t>适用版本 v2.7　·　Novel Jazz Engine</w:t>
       </w:r>
     </w:p>
     <w:p/>
@@ -1210,6 +1210,30 @@
           <w:b w:val="0"/>
         </w:rPr>
         <w:t>关系网络比继续给人加形容词更重要：它决定“谁必须合作、谁可能互相阻碍、一个人的选择如何代价化另一个人”。</w:t>
+      </w:r>
+    </w:p>
+    <w:p>
+      <w:pPr>
+        <w:pStyle w:val="ListBullet"/>
+      </w:pPr>
+      <w:r>
+        <w:t>每章可记录关系变化（谁与谁 / 如何变 / 因为什么）；转折类章节会依据关系里的“压力点/可能走向”自动生成。</w:t>
+      </w:r>
+    </w:p>
+    <w:p>
+      <w:pPr>
+        <w:pStyle w:val="ListBullet"/>
+      </w:pPr>
+      <w:r>
+        <w:t>校验会提示：未定义的关系发生了变化、关系变化缺少原因、已定义的关系在全书中从未发生变化。</w:t>
+      </w:r>
+    </w:p>
+    <w:p>
+      <w:pPr>
+        <w:pStyle w:val="ListBullet"/>
+      </w:pPr>
+      <w:r>
+        <w:t>用 python main.py chars 或 GUI「人物」页可查看每条关系在哪些章发生变化。</w:t>
       </w:r>
     </w:p>
     <w:p>

</xml_diff>

<commit_message>
v2.8: complete character/relationship pipeline (typed fields, primary id, id resolution, diagnostics, JSON editor)
- typed CharacterDecision/KnowledgeChange/RelationshipChange; ChapterPlan uses them; expander + _chapter_from_dict + LLM volume prompt all carry decisions & knowledge (same contract)
- BookPlan.primary_character_id (order-independent convergence); expander converge by it
- Session.resolve_character (id/name/alias) + setup_warnings (dup ids, dangling relationship endpoints, no POV core)
- plot_validator: relationship isolation (disconnected groups) diagnostics
- Character.brief(story/chapter) + as_prompt include worldview/memory/current_goal/blind_spots/secrets/capabilities/constraints
- nested-field editor: GUI 卡片JSON tab + CLI outline --edit-json
- tests/test_v28.py (+7): pov filter, primary converge, resolve, setup warnings, nested persistence, LLM decisions/knowledge, isolation
- beginner guide regenerated to v2.8; 71 tests
</commit_message>
<xml_diff>
--- a/docs/JazzWriter_新手引导.docx
+++ b/docs/JazzWriter_新手引导.docx
@@ -38,7 +38,7 @@
           <w:color w:val="999999"/>
           <w:sz w:val="22"/>
         </w:rPr>
-        <w:t>适用版本 v2.7　·　Novel Jazz Engine</w:t>
+        <w:t>适用版本 v2.8　·　Novel Jazz Engine</w:t>
       </w:r>
     </w:p>
     <w:p/>
@@ -1225,7 +1225,7 @@
         <w:pStyle w:val="ListBullet"/>
       </w:pPr>
       <w:r>
-        <w:t>校验会提示：未定义的关系发生了变化、关系变化缺少原因、已定义的关系在全书中从未发生变化。</w:t>
+        <w:t>校验会提示：未定义的关系发生了变化、关系变化缺少原因、已定义的关系在全书中从未发生变化，以及“与主角隔离的人物关系组”。</w:t>
       </w:r>
     </w:p>
     <w:p>
@@ -1234,6 +1234,22 @@
       </w:pPr>
       <w:r>
         <w:t>用 python main.py chars 或 GUI「人物」页可查看每条关系在哪些章发生变化。</w:t>
+      </w:r>
+    </w:p>
+    <w:p>
+      <w:pPr>
+        <w:pStyle w:val="ListBullet"/>
+      </w:pPr>
+      <w:r>
+        <w:t>引用人物可用稳定 id、姓名或别名（系统会解析到同一人物）；主角由“核心且可作视角”的第一人确定，不依赖文件顺序。</w:t>
+      </w:r>
+    </w:p>
+    <w:p>
+      <w:pPr>
+        <w:pStyle w:val="ListBullet"/>
+      </w:pPr>
+      <w:r>
+        <w:t>每章的人物决策/认知变化/关系变化是结构化数据，可在 GUI「卡片JSON」标签页直接编辑并保存。</w:t>
       </w:r>
     </w:p>
     <w:p>
@@ -1770,6 +1786,28 @@
           <w:p>
             <w:r>
               <w:t>采纳候选并重生成后续</w:t>
+            </w:r>
+          </w:p>
+        </w:tc>
+      </w:tr>
+      <w:tr>
+        <w:tc>
+          <w:tcPr>
+            <w:tcW w:type="dxa" w:w="4320"/>
+          </w:tcPr>
+          <w:p>
+            <w:r>
+              <w:t>python main.py outline --edit-json 3 --file card.json</w:t>
+            </w:r>
+          </w:p>
+        </w:tc>
+        <w:tc>
+          <w:tcPr>
+            <w:tcW w:type="dxa" w:w="4320"/>
+          </w:tcPr>
+          <w:p>
+            <w:r>
+              <w:t>用 JSON 更新第 3 章（支持嵌套人物/关系字段）</w:t>
             </w:r>
           </w:p>
         </w:tc>

</xml_diff>

<commit_message>
v2.9: knowledge continuity checks + wiring tests
- KnowledgeChange.fact_id; plot_validator knowledge continuity: source required, source must predate the chapter, secret-reveal hint (via story_state)
- StructureEvaluator/Session.validate_book pass story_state
- tests/test_v29.py (+4): relationships reach planner, story-state facts/forbidden reach plan, knowledge continuity (missing/future source, secret hint, clean)
- beginner guide regenerated to v2.9; 77 tests
</commit_message>
<xml_diff>
--- a/docs/JazzWriter_新手引导.docx
+++ b/docs/JazzWriter_新手引导.docx
@@ -38,7 +38,7 @@
           <w:color w:val="999999"/>
           <w:sz w:val="22"/>
         </w:rPr>
-        <w:t>适用版本 v2.8　·　Novel Jazz Engine</w:t>
+        <w:t>适用版本 v2.9　·　Novel Jazz Engine</w:t>
       </w:r>
     </w:p>
     <w:p/>
@@ -1250,6 +1250,14 @@
       </w:pPr>
       <w:r>
         <w:t>每章的人物决策/认知变化/关系变化是结构化数据，可在 GUI「卡片JSON」标签页直接编辑并保存。</w:t>
+      </w:r>
+    </w:p>
+    <w:p>
+      <w:pPr>
+        <w:pStyle w:val="ListBullet"/>
+      </w:pPr>
+      <w:r>
+        <w:t>认知连续性：每章「认知变化」必须给出信息来源，来源不能指向不早于本章的时间；涉及作者保留的秘密时系统会提示确认揭露时机。</w:t>
       </w:r>
     </w:p>
     <w:p>

</xml_diff>

<commit_message>
v2.10: idea 5-dim comparison, fusion diff, chapter-level character context, structured participation editor, relationship-evolution dimension
- StoryIdea.theme_reading; ideas/LLM/fuse carry it; distinctness over 5 dims
- Session.compare_ideas (5 dims) + fuse_compare (which dim came from A/B); CLI 5-dim table + fusion table; GUI comparison + fusion render
- BookPlanner._chapter_cast_brief injected into per-volume prompt; expander decisions use current_goal; reimproviser prompt adds pov chapter brief
- core/chapter_plan: format/parse decisions/knowledge/relationships; GUI '编辑人物/关系变化（表单）' dialog
- StructureEvaluator: relationship_evolution dimension (changed ratio + causes)
- tests/test_v30.py (+7); beginner guide v2.10; 85 tests
</commit_message>
<xml_diff>
--- a/docs/JazzWriter_新手引导.docx
+++ b/docs/JazzWriter_新手引导.docx
@@ -38,7 +38,7 @@
           <w:color w:val="999999"/>
           <w:sz w:val="22"/>
         </w:rPr>
-        <w:t>适用版本 v2.9　·　Novel Jazz Engine</w:t>
+        <w:t>适用版本 v2.10　·　Novel Jazz Engine</w:t>
       </w:r>
     </w:p>
     <w:p/>
@@ -1262,6 +1262,14 @@
     </w:p>
     <w:p>
       <w:pPr>
+        <w:pStyle w:val="ListBullet"/>
+      </w:pPr>
+      <w:r>
+        <w:t>结构化编辑：点「编辑人物/关系变化（表单）」用简表编辑本章的决策/认知/关系变化；也可在「卡片JSON」里直接改整张卡片。</w:t>
+      </w:r>
+    </w:p>
+    <w:p>
+      <w:pPr>
         <w:pStyle w:val="Heading2"/>
       </w:pPr>
       <w:r>
@@ -1354,6 +1362,14 @@
       </w:pPr>
       <w:r>
         <w:t>导出：结构（Markdown）与故事板（Markdown/HTML）。</w:t>
+      </w:r>
+    </w:p>
+    <w:p>
+      <w:r>
+        <w:rPr>
+          <w:b w:val="0"/>
+        </w:rPr>
+        <w:t>创意阶段提供两种对照：“五维并排对照”（因果机制 / 信息结构·真相 / 人物关系 / 结局 / 主题解释）与“融合对照”（融合后每个维度取自 A 还是 B）。结构评价在六维之外新增“关系演变”维度。</w:t>
       </w:r>
     </w:p>
     <w:p>

</xml_diff>

<commit_message>
v2.11: vector memory, interactive storyboard, jam multi-round debate, model-generated scene skeletons
- engine/vector_store.py: persistent semantic store (embedding if available, else CJK lexical); Session.vector_memory/vector_search; CLI 'memory --rebuild/--query'
- report.build_html now interactive (POV filter, search, click-to-inspect); GUI button opens it
- jam_session: Observer.rebut -> Soloist.respond -> Editor attribution; Session.jam(rounds=2); CLI 'jam --rounds'; JamResult.debate/attribution/rounds
- ScenePlanner LLM path (model-generated skeletons) with rule-based fallback; Session.plan(use_llm)
- tests/test_v31.py (+6); beginner guide v2.11; 91 tests
</commit_message>
<xml_diff>
--- a/docs/JazzWriter_新手引导.docx
+++ b/docs/JazzWriter_新手引导.docx
@@ -38,7 +38,7 @@
           <w:color w:val="999999"/>
           <w:sz w:val="22"/>
         </w:rPr>
-        <w:t>适用版本 v2.10　·　Novel Jazz Engine</w:t>
+        <w:t>适用版本 v2.11　·　Novel Jazz Engine</w:t>
       </w:r>
     </w:p>
     <w:p/>
@@ -1437,6 +1437,22 @@
       </w:r>
     </w:p>
     <w:p>
+      <w:r>
+        <w:rPr>
+          <w:b w:val="0"/>
+        </w:rPr>
+        <w:t>多轮合奏（rounds≥2）：观察者会先**反驳**独奏者（太笼统/直说主题/复述既有冲突），独奏者据此**修订**，Editor 再**归因**（哪个想法来自谁）。命令行：`jam --rounds 2`。</w:t>
+      </w:r>
+    </w:p>
+    <w:p>
+      <w:r>
+        <w:rPr>
+          <w:b w:val="0"/>
+        </w:rPr>
+        <w:t>「导出故事板」产出的是**可交互 HTML**：可按视角筛选、搜索关键词、点击章节查看卡片；向量记忆用 `python main.py memory --rebuild` / `--query` 做章节语义检索。</w:t>
+      </w:r>
+    </w:p>
+    <w:p>
       <w:pPr>
         <w:pStyle w:val="Heading1"/>
       </w:pPr>
@@ -1634,6 +1650,50 @@
           <w:p>
             <w:r>
               <w:t>查看人物库、使用情况与关系网络</w:t>
+            </w:r>
+          </w:p>
+        </w:tc>
+      </w:tr>
+      <w:tr>
+        <w:tc>
+          <w:tcPr>
+            <w:tcW w:type="dxa" w:w="4320"/>
+          </w:tcPr>
+          <w:p>
+            <w:r>
+              <w:t>python main.py memory --rebuild</w:t>
+            </w:r>
+          </w:p>
+        </w:tc>
+        <w:tc>
+          <w:tcPr>
+            <w:tcW w:type="dxa" w:w="4320"/>
+          </w:tcPr>
+          <w:p>
+            <w:r>
+              <w:t>从当前结构重建向量记忆（语义检索库）</w:t>
+            </w:r>
+          </w:p>
+        </w:tc>
+      </w:tr>
+      <w:tr>
+        <w:tc>
+          <w:tcPr>
+            <w:tcW w:type="dxa" w:w="4320"/>
+          </w:tcPr>
+          <w:p>
+            <w:r>
+              <w:t>python main.py memory --query "..."</w:t>
+            </w:r>
+          </w:p>
+        </w:tc>
+        <w:tc>
+          <w:tcPr>
+            <w:tcW w:type="dxa" w:w="4320"/>
+          </w:tcPr>
+          <w:p>
+            <w:r>
+              <w:t>按语义检索最相近的章节</w:t>
             </w:r>
           </w:p>
         </w:tc>

</xml_diff>

<commit_message>
docs: overall rewrite of README (v2.11) and beginner guide
- README reorganised: workflow, quickstart, command table, concepts, controlled divergence, structure engine, memory/visualization, jam, LLM, data, architecture, principles, tests, version history (deduped, correct order, count=91)
- beginner guide: add 卡片JSON tab row; keep v2.11 consistent
- 91 tests still green
</commit_message>
<xml_diff>
--- a/docs/JazzWriter_新手引导.docx
+++ b/docs/JazzWriter_新手引导.docx
@@ -834,6 +834,28 @@
           <w:p>
             <w:r>
               <w:t>逐章浏览与编辑</w:t>
+            </w:r>
+          </w:p>
+        </w:tc>
+      </w:tr>
+      <w:tr>
+        <w:tc>
+          <w:tcPr>
+            <w:tcW w:type="dxa" w:w="4320"/>
+          </w:tcPr>
+          <w:p>
+            <w:r>
+              <w:t>卡片JSON</w:t>
+            </w:r>
+          </w:p>
+        </w:tc>
+        <w:tc>
+          <w:tcPr>
+            <w:tcW w:type="dxa" w:w="4320"/>
+          </w:tcPr>
+          <w:p>
+            <w:r>
+              <w:t>整张章节卡片（含人物决策/认知/关系变化）的 JSON 编辑</w:t>
             </w:r>
           </w:p>
         </w:tc>

</xml_diff>

<commit_message>
v2.13: complete project isolation, duplicate-id handling, reimprovise consistency, offline sanitize, POV guard
- project scope for runs / chapters / advice / story_state / jazz_state (Session data_dir); CLI/GUI pass project dirs
- load_characters keeps duplicate ids under unique keys; setup_warnings now sees them; reimproviser drops name-keyed dict
- reimprovise: characters_involved & pov_character_id follow the candidate POV; knowledge source anchored to a thread
- offline OutlineExpander sanitizes ALL fields (title/hooks/threads) and per-POV secret reveals
- BookPlanner.build errors when no POV-eligible character; compose_book no longer cycles scenes (matches README)
- tests/test_v33.py (+7); beginner guide regenerated to v2.13; 106 tests
</commit_message>
<xml_diff>
--- a/docs/JazzWriter_新手引导.docx
+++ b/docs/JazzWriter_新手引导.docx
@@ -38,7 +38,7 @@
           <w:color w:val="999999"/>
           <w:sz w:val="22"/>
         </w:rPr>
-        <w:t>适用版本 v2.11　·　Novel Jazz Engine</w:t>
+        <w:t>适用版本 v2.13　·　Novel Jazz Engine</w:t>
       </w:r>
     </w:p>
     <w:p/>
@@ -2361,7 +2361,7 @@
           </w:tcPr>
           <w:p>
             <w:r>
-              <w:t>output/book_plan.json</w:t>
+              <w:t>&lt;数据目录&gt;/book_plan.json</w:t>
             </w:r>
           </w:p>
         </w:tc>
@@ -2383,7 +2383,7 @@
           </w:tcPr>
           <w:p>
             <w:r>
-              <w:t>output/book_outline.md</w:t>
+              <w:t>&lt;数据目录&gt;/book_outline.md</w:t>
             </w:r>
           </w:p>
         </w:tc>
@@ -2405,7 +2405,7 @@
           </w:tcPr>
           <w:p>
             <w:r>
-              <w:t>output/story_report.md / .html</w:t>
+              <w:t>&lt;数据目录&gt;/story_report.md / .html</w:t>
             </w:r>
           </w:p>
         </w:tc>
@@ -2415,7 +2415,29 @@
           </w:tcPr>
           <w:p>
             <w:r>
-              <w:t>故事板导出</w:t>
+              <w:t>故事板导出（交互式 HTML）</w:t>
+            </w:r>
+          </w:p>
+        </w:tc>
+      </w:tr>
+      <w:tr>
+        <w:tc>
+          <w:tcPr>
+            <w:tcW w:type="dxa" w:w="4320"/>
+          </w:tcPr>
+          <w:p>
+            <w:r>
+              <w:t>&lt;数据目录&gt;/vector_store.json</w:t>
+            </w:r>
+          </w:p>
+        </w:tc>
+        <w:tc>
+          <w:tcPr>
+            <w:tcW w:type="dxa" w:w="4320"/>
+          </w:tcPr>
+          <w:p>
+            <w:r>
+              <w:t>向量记忆（语义检索库）</w:t>
             </w:r>
           </w:p>
         </w:tc>
@@ -2444,6 +2466,14 @@
       </w:tr>
     </w:tbl>
     <w:p/>
+    <w:p>
+      <w:r>
+        <w:rPr>
+          <w:b w:val="0"/>
+        </w:rPr>
+        <w:t>提示：用 --data &lt;目录&gt; 切换独立小说项目时，全书规划、结构导出、向量库、故事板、运行记录、章节正文与参数状态都保存在该项目目录下，不同项目互不干扰。</w:t>
+      </w:r>
+    </w:p>
     <w:p>
       <w:pPr>
         <w:pStyle w:val="Heading1"/>

</xml_diff>

<commit_message>
v2.14: explicit LLM review item for semantic conflicts with established facts
- NarrativeReviewer gains an explicit fact-conflict review: compares chapters against story_state confirmed facts, returns findings (kind=fact_conflict) with chapter + cited fact
- offline: reports 'requires a model, not judged' (kind=fact_check) instead of silently passing
- StructureEvaluator/Session pass story_state to the reviewer; CLI/GUI flag fact-conflict findings
- tests/test_v34.py (+5); beginner guide regenerated to v2.14; 111 tests
</commit_message>
<xml_diff>
--- a/docs/JazzWriter_新手引导.docx
+++ b/docs/JazzWriter_新手引导.docx
@@ -38,7 +38,7 @@
           <w:color w:val="999999"/>
           <w:sz w:val="22"/>
         </w:rPr>
-        <w:t>适用版本 v2.13　·　Novel Jazz Engine</w:t>
+        <w:t>适用版本 v2.14　·　Novel Jazz Engine</w:t>
       </w:r>
     </w:p>
     <w:p/>
@@ -360,6 +360,14 @@
           <w:b w:val="0"/>
         </w:rPr>
         <w:t>校验分两层：结构硬校验（缺章/编号/断链/未回收线索/闲置人物）+ 叙事审阅（事件是否合理、人物选择是否成立、结局是否回应开篇，给出依据与章号）。</w:t>
+      </w:r>
+    </w:p>
+    <w:p>
+      <w:r>
+        <w:rPr>
+          <w:b w:val="0"/>
+        </w:rPr>
+        <w:t>另有一项显式检查：与“已确定事实”的语义冲突（如事实称设备从未修复，章节却写已修复）。该项需要模型判断；离线运行时系统会明确标注“需接入模型、不判定”，不会静默通过。</w:t>
       </w:r>
     </w:p>
     <w:p>

</xml_diff>

<commit_message>
v2.15: re-improvise keeps POV/participants fixed; project A/B isolation + end-to-end tests
- ChapterReimproviser: re-improvisation preserves the chapter's POV and characters_involved (only content changes), so displayed POV / stable id / involvement always match; LLM prompt tells the model not to change them
- tests/test_v35.py: two temp projects never cross (runs/advice/history), POV stays fixed for offline and LLM candidates, and the full build->save->lock->reimprovise->adopt->reload workflow
- README + beginner guide v2.15; 115 tests
</commit_message>
<xml_diff>
--- a/docs/JazzWriter_新手引导.docx
+++ b/docs/JazzWriter_新手引导.docx
@@ -38,7 +38,7 @@
           <w:color w:val="999999"/>
           <w:sz w:val="22"/>
         </w:rPr>
-        <w:t>适用版本 v2.14　·　Novel Jazz Engine</w:t>
+        <w:t>适用版本 v2.15　·　Novel Jazz Engine</w:t>
       </w:r>
     </w:p>
     <w:p/>
@@ -391,7 +391,7 @@
         <w:rPr>
           <w:b w:val="0"/>
         </w:rPr>
-        <w:t>想改某章时点「重新即兴选中章」：系统**先给出候选**（显示改动字段），你**采纳后才写回**；未选中的章节与锁定内容不受影响。</w:t>
+        <w:t>想改某章时点「重新即兴选中章」：系统先给出候选（显示改动字段），你采纳后才写回；未选中的章节与锁定内容不受影响。重新即兴会保持该章的 POV 与参与人物不变（只改行动/冲突/结果等），保证人物记录与新章节一致。</w:t>
       </w:r>
     </w:p>
     <w:p>

</xml_diff>

<commit_message>
v2.16: project management — create/open novel projects from a brief
- engine/project_manager.py: ProjectManager/ProjectBuilder; a free-form brief becomes projects/<slug>/ with story/characters/relationships/motifs/story_state + brief.md (LLM expansion, offline starter set)
- GUI: top project dropdown + Open / New-project dialog (name + brief); data_dir switching so each project is isolated
- CLI: 'project list' / 'project new NAME --brief ...'
- tests/test_v36.py (+4); README + beginner guide v2.16; 119 tests
</commit_message>
<xml_diff>
--- a/docs/JazzWriter_新手引导.docx
+++ b/docs/JazzWriter_新手引导.docx
@@ -38,7 +38,7 @@
           <w:color w:val="999999"/>
           <w:sz w:val="22"/>
         </w:rPr>
-        <w:t>适用版本 v2.15　·　Novel Jazz Engine</w:t>
+        <w:t>适用版本 v2.16　·　Novel Jazz Engine</w:t>
       </w:r>
     </w:p>
     <w:p/>
@@ -408,6 +408,46 @@
           <w:b w:val="0"/>
         </w:rPr>
         <w:t>点「导出结构 Markdown」得到结构文件；点「导出故事板（md/html）」得到可视化故事板（动机时间线 / 人物弧线 / 伏笔面板 / 偏离检测）。</w:t>
+      </w:r>
+    </w:p>
+    <w:p>
+      <w:pPr>
+        <w:pStyle w:val="Heading2"/>
+      </w:pPr>
+      <w:r>
+        <w:t>新建 / 打开项目</w:t>
+      </w:r>
+    </w:p>
+    <w:p>
+      <w:r>
+        <w:rPr>
+          <w:b w:val="0"/>
+        </w:rPr>
+        <w:t>GUI 顶部有「项目」下拉与两个按钮：</w:t>
+      </w:r>
+    </w:p>
+    <w:p>
+      <w:pPr>
+        <w:pStyle w:val="ListBullet"/>
+      </w:pPr>
+      <w:r>
+        <w:t>新建项目：填写名称与“世界观/大致剧情”，程序在 projects/ 下生成一套独立乐谱（story / characters / relationships / motifs / story_state），并自动打开。</w:t>
+      </w:r>
+    </w:p>
+    <w:p>
+      <w:pPr>
+        <w:pStyle w:val="ListBullet"/>
+      </w:pPr>
+      <w:r>
+        <w:t>打开：从下拉选择已存在的项目，数据目录随之切换，规划/正文/历史都写进该项目。</w:t>
+      </w:r>
+    </w:p>
+    <w:p>
+      <w:r>
+        <w:rPr>
+          <w:b w:val="0"/>
+        </w:rPr>
+        <w:t>命令行等价操作：python main.py project list / python main.py project new "名称" --brief "…"，之后用 --data projects/&lt;目录&gt; 继续。</w:t>
       </w:r>
     </w:p>
     <w:p>
@@ -1735,6 +1775,50 @@
           </w:tcPr>
           <w:p>
             <w:r>
+              <w:t>python main.py project list</w:t>
+            </w:r>
+          </w:p>
+        </w:tc>
+        <w:tc>
+          <w:tcPr>
+            <w:tcW w:type="dxa" w:w="4320"/>
+          </w:tcPr>
+          <w:p>
+            <w:r>
+              <w:t>列出已有项目（projects/）</w:t>
+            </w:r>
+          </w:p>
+        </w:tc>
+      </w:tr>
+      <w:tr>
+        <w:tc>
+          <w:tcPr>
+            <w:tcW w:type="dxa" w:w="4320"/>
+          </w:tcPr>
+          <w:p>
+            <w:r>
+              <w:t>python main.py project new "名称" --brief "…"</w:t>
+            </w:r>
+          </w:p>
+        </w:tc>
+        <w:tc>
+          <w:tcPr>
+            <w:tcW w:type="dxa" w:w="4320"/>
+          </w:tcPr>
+          <w:p>
+            <w:r>
+              <w:t>按世界观/剧情生成新项目</w:t>
+            </w:r>
+          </w:p>
+        </w:tc>
+      </w:tr>
+      <w:tr>
+        <w:tc>
+          <w:tcPr>
+            <w:tcW w:type="dxa" w:w="4320"/>
+          </w:tcPr>
+          <w:p>
+            <w:r>
               <w:t>python main.py outline "前提" --branches 3</w:t>
             </w:r>
           </w:p>

</xml_diff>

<commit_message>
v2.17: edit/rebuild a project from an updated brief; clearer project open feedback
- ProjectManager.regenerate(): rebuild story/characters/relationships/motifs/story_state from a new brief; old files (incl. saved book_plan/vector) moved to _backup_*; find()/read_brief()
- CLI: 'project show <dir>' and 'project regen <dir> [--file]'
- GUI: '编辑/重建' button (prefilled brief + confirm), open-project confirmation + current-project label in the toolbar
- tests/test_v37.py (+3); README + guide v2.17; 122 tests
</commit_message>
<xml_diff>
--- a/docs/JazzWriter_新手引导.docx
+++ b/docs/JazzWriter_新手引导.docx
@@ -38,7 +38,7 @@
           <w:color w:val="999999"/>
           <w:sz w:val="22"/>
         </w:rPr>
-        <w:t>适用版本 v2.16　·　Novel Jazz Engine</w:t>
+        <w:t>适用版本 v2.17　·　Novel Jazz Engine</w:t>
       </w:r>
     </w:p>
     <w:p/>
@@ -439,7 +439,15 @@
         <w:pStyle w:val="ListBullet"/>
       </w:pPr>
       <w:r>
-        <w:t>打开：从下拉选择已存在的项目，数据目录随之切换，规划/正文/历史都写进该项目。</w:t>
+        <w:t>打开：从下拉选择已存在的项目，点“打开”；数据目录随之切换，规划/正文/历史都写进该项目（打开后会弹确认，右侧显示“项目：…”）。</w:t>
+      </w:r>
+    </w:p>
+    <w:p>
+      <w:pPr>
+        <w:pStyle w:val="ListBullet"/>
+      </w:pPr>
+      <w:r>
+        <w:t>编辑/重建：修改项目简介并重建，程序按新简介重新生成整套设定；旧文件（含已保存结构）会移入 _backup_* 目录，之后需重新“生成创意→采纳并展开”。</w:t>
       </w:r>
     </w:p>
     <w:p>
@@ -447,7 +455,7 @@
         <w:rPr>
           <w:b w:val="0"/>
         </w:rPr>
-        <w:t>命令行等价操作：python main.py project list / python main.py project new "名称" --brief "…"，之后用 --data projects/&lt;目录&gt; 继续。</w:t>
+        <w:t>命令行：python main.py project list / show &lt;目录&gt; / new "名称" --brief "…" / regen &lt;目录&gt; --file 简介.txt；之后用 --data projects/&lt;目录&gt; 继续。</w:t>
       </w:r>
     </w:p>
     <w:p>

</xml_diff>

<commit_message>
v2.18: online manuscript preview (GitHub Pages) auto-synced on render
- engine/preview.py: self-contained reader HTML + index
- Session.publish_preview(): writes docs/preview/<project>.html + index.html and (by default) git add/commit/push docs/preview; env NJE_PREVIEW_AUTOPUSH=0 or push=False to disable; preview_url() derives pages URL from origin remote
- render_book_from_plan(publish=True); CLI 'book --from-plan [--no-publish]' prints the URL; new 'preview' command re-publishes from saved chapters; GUI shows the preview URL after rendering
- tests/test_v38.py (+3); README + guide v2.18; 125 tests
</commit_message>
<xml_diff>
--- a/docs/JazzWriter_新手引导.docx
+++ b/docs/JazzWriter_新手引导.docx
@@ -38,7 +38,7 @@
           <w:color w:val="999999"/>
           <w:sz w:val="22"/>
         </w:rPr>
-        <w:t>适用版本 v2.17　·　Novel Jazz Engine</w:t>
+        <w:t>适用版本 v2.18　·　Novel Jazz Engine</w:t>
       </w:r>
     </w:p>
     <w:p/>
@@ -1472,6 +1472,14 @@
           <w:b w:val="0"/>
         </w:rPr>
         <w:t>用已生成的章节摘要作为场景，顺序写成正文（可选）。按钮：「按结构渲染正文」。</w:t>
+      </w:r>
+    </w:p>
+    <w:p>
+      <w:r>
+        <w:rPr>
+          <w:b w:val="0"/>
+        </w:rPr>
+        <w:t>在线正文预览：每次渲染都会生成一个自包含阅读页，并默认同步到远端——docs/preview/&lt;项目&gt;.html 与索引 index.html。启用 GitHub Pages（仓库 Settings → Pages → Source 选 main 分支 /docs）后，即可在 https://&lt;用户名&gt;.github.io/&lt;仓库&gt;/preview/ 阅读。不想自动推送可设环境变量 NJE_PREVIEW_AUTOPUSH=0，或命令加 --no-publish。</w:t>
       </w:r>
     </w:p>
     <w:p>

</xml_diff>

<commit_message>
v2.19: delete a project (local + remove its online preview)
- ProjectManager.delete(): removes projects/<dir> and docs/preview/<slug>.html, rebuilds index, then git add/commit/push docs/preview; returns {preview_removed, pushed}
- engine/preview.py: extract reusable git_publish(); Session reuses it
- CLI: 'project delete <target> --yes [--no-publish]'
- GUI: '删除项目' button (confirm dialog)
- tests/test_v39.py (+2); README + guide v2.19; 127 tests
</commit_message>
<xml_diff>
--- a/docs/JazzWriter_新手引导.docx
+++ b/docs/JazzWriter_新手引导.docx
@@ -38,7 +38,7 @@
           <w:color w:val="999999"/>
           <w:sz w:val="22"/>
         </w:rPr>
-        <w:t>适用版本 v2.18　·　Novel Jazz Engine</w:t>
+        <w:t>适用版本 v2.19　·　Novel Jazz Engine</w:t>
       </w:r>
     </w:p>
     <w:p/>
@@ -448,6 +448,14 @@
       </w:pPr>
       <w:r>
         <w:t>编辑/重建：修改项目简介并重建，程序按新简介重新生成整套设定；旧文件（含已保存结构）会移入 _backup_* 目录，之后需重新“生成创意→采纳并展开”。</w:t>
+      </w:r>
+    </w:p>
+    <w:p>
+      <w:pPr>
+        <w:pStyle w:val="ListBullet"/>
+      </w:pPr>
+      <w:r>
+        <w:t>删除项目：删除本地目录，并同步移除在线预览（docs/preview/&lt;项目&gt;.html）并推送，索引随之更新。</w:t>
       </w:r>
     </w:p>
     <w:p>
@@ -1835,6 +1843,28 @@
           </w:tcPr>
           <w:p>
             <w:r>
+              <w:t>python main.py project delete "名称" --yes</w:t>
+            </w:r>
+          </w:p>
+        </w:tc>
+        <w:tc>
+          <w:tcPr>
+            <w:tcW w:type="dxa" w:w="4320"/>
+          </w:tcPr>
+          <w:p>
+            <w:r>
+              <w:t>删除项目（本地 + 同步移除在线预览）</w:t>
+            </w:r>
+          </w:p>
+        </w:tc>
+      </w:tr>
+      <w:tr>
+        <w:tc>
+          <w:tcPr>
+            <w:tcW w:type="dxa" w:w="4320"/>
+          </w:tcPr>
+          <w:p>
+            <w:r>
               <w:t>python main.py outline "前提" --branches 3</w:t>
             </w:r>
           </w:p>

</xml_diff>

<commit_message>
v2.20: per-chapter and whole-book word counts (GUI/CLI/preview); retry preview push
- textutil.word_count (CJK chars + latin words); Take.word_count + saved in take json
- preview shows per-chapter word count + whole-book total
- CLI 'book' overview adds 字数 column + total; 'preview' prints total
- GUI 正文 tab shows per-chapter and total counts
- git_publish retries push up to 3 times (fixes 'commit ok but push failed' leaving stale online preview)
- tests/test_v40.py (+4); README + guide v2.20; 131 tests
</commit_message>
<xml_diff>
--- a/docs/JazzWriter_新手引导.docx
+++ b/docs/JazzWriter_新手引导.docx
@@ -38,7 +38,7 @@
           <w:color w:val="999999"/>
           <w:sz w:val="22"/>
         </w:rPr>
-        <w:t>适用版本 v2.19　·　Novel Jazz Engine</w:t>
+        <w:t>适用版本 v2.20　·　Novel Jazz Engine</w:t>
       </w:r>
     </w:p>
     <w:p/>
@@ -1488,6 +1488,14 @@
           <w:b w:val="0"/>
         </w:rPr>
         <w:t>在线正文预览：每次渲染都会生成一个自包含阅读页，并默认同步到远端——docs/preview/&lt;项目&gt;.html 与索引 docs/preview/index.html。启用 GitHub Pages 后即可在 https://&lt;用户名&gt;.github.io/&lt;仓库&gt;/preview/ 阅读。开启方法：打开仓库的 Settings → Pages（地址形如 https://github.com/&lt;用户名&gt;/&lt;仓库&gt;/settings/pages，注意不是右上角头像里的账号设置），Build and deployment → Source 选 Deploy from a branch → Branch main、Folder /docs → Save（预览位于 docs/preview/，站点根为 docs/index.html）。不想自动推送可设环境变量 NJE_PREVIEW_AUTOPUSH=0，或命令加 --no-publish。</w:t>
+      </w:r>
+    </w:p>
+    <w:p>
+      <w:r>
+        <w:rPr>
+          <w:b w:val="0"/>
+        </w:rPr>
+        <w:t>字数统计：渲染会为每章统计字数，并给出全书总字数；在线预览的每章标题与页脚、GUI「正文」页、CLI `book` 概览表都会显示。</w:t>
       </w:r>
     </w:p>
     <w:p>

</xml_diff>

<commit_message>
v2.21: safety fixes — path containment for delete/regenerate; preview commit limited to its path
- ProjectManager.find/_require_project: only accept real projects inside projects/ (has story.yaml); reject anything outside root
- delete()/regenerate() hard-refuse paths outside projects root or without story.yaml (ValueError); CLI cannot bypass
- preview.git_publish: commit with explicit pathspec (-- docs/preview) and skip when no change, so unrelated already-staged files are never committed/pushed
- tests/test_v41.py (+4); README + guide v2.21; 135 tests
</commit_message>
<xml_diff>
--- a/docs/JazzWriter_新手引导.docx
+++ b/docs/JazzWriter_新手引导.docx
@@ -38,7 +38,7 @@
           <w:color w:val="999999"/>
           <w:sz w:val="22"/>
         </w:rPr>
-        <w:t>适用版本 v2.20　·　Novel Jazz Engine</w:t>
+        <w:t>适用版本 v2.21　·　Novel Jazz Engine</w:t>
       </w:r>
     </w:p>
     <w:p/>
@@ -456,6 +456,14 @@
       </w:pPr>
       <w:r>
         <w:t>删除项目：删除本地目录，并同步移除在线预览（docs/preview/&lt;项目&gt;.html）并推送，索引随之更新。</w:t>
+      </w:r>
+    </w:p>
+    <w:p>
+      <w:pPr>
+        <w:pStyle w:val="ListBullet"/>
+      </w:pPr>
+      <w:r>
+        <w:t>安全护栏：删除/重建只作用于 projects/ 内的真实项目目录；该目录之外的路径会被拒绝（命令行同样受限）。自动发布的提交范围也仅限 docs/preview 的目标文件，不会连带提交你已暂存的其它改动。</w:t>
       </w:r>
     </w:p>
     <w:p>

</xml_diff>

<commit_message>
v2.22: adopt expert P1 hardening (direct-child projects, symlink-safe validation, scoped/path-safe preview publish, refuse when branch ahead of origin)
- ProjectManager._validated_project: project must be a direct child of projects root with story.yaml; resolve() blocks symlink escapes; find/regenerate/delete all route through it; rejects projects root itself
- preview.git_publish: validate add_path (reject traversal/absolute/pathspec magic/leading '-'), require an origin upstream, refuse when local branch is ahead of @{u} (avoids publishing unrelated commits), use 'git commit --only -- <path>' and 'git diff --cached --quiet' to scope the commit
- tests/test_p1_safety_fixes.py (expert regression suite, +7); updated test_v37/test_v41
- README + guide v2.22; 141 tests
</commit_message>
<xml_diff>
--- a/docs/JazzWriter_新手引导.docx
+++ b/docs/JazzWriter_新手引导.docx
@@ -38,7 +38,7 @@
           <w:color w:val="999999"/>
           <w:sz w:val="22"/>
         </w:rPr>
-        <w:t>适用版本 v2.21　·　Novel Jazz Engine</w:t>
+        <w:t>适用版本 v2.22　·　Novel Jazz Engine</w:t>
       </w:r>
     </w:p>
     <w:p/>
@@ -463,7 +463,15 @@
         <w:pStyle w:val="ListBullet"/>
       </w:pPr>
       <w:r>
-        <w:t>安全护栏：删除/重建只作用于 projects/ 内的真实项目目录；该目录之外的路径会被拒绝（命令行同样受限）。自动发布的提交范围也仅限 docs/preview 的目标文件，不会连带提交你已暂存的其它改动。</w:t>
+        <w:t>安全护栏：删除/重建只作用于 projects/ 的直系子目录、且必须是含 story.yaml 的真实项目；根目录之外、根目录本身或缺 story.yaml 的路径都会被拒绝（命令行同样受限）。</w:t>
+      </w:r>
+    </w:p>
+    <w:p>
+      <w:pPr>
+        <w:pStyle w:val="ListBullet"/>
+      </w:pPr>
+      <w:r>
+        <w:t>发布安全：自动提交只含 docs/preview 目标文件，并拒绝非法路径；若当前分支有未推送提交或没有 origin upstream，会自动中止发布，避免连带公开其它改动。</w:t>
       </w:r>
     </w:p>
     <w:p>

</xml_diff>

<commit_message>
v2.29: default to a real model - opencode (Go) + embedding eval, mock as fallback
- llm/defaults.py: DEFAULT_PROVIDER=opencode, DEFAULT_EVAL_MODE=embedding,
  DEFAULT_OPENCODE_MODEL=opencode-go/deepseek-v4.1-flash
- cli: --provider default opencode, --eval-mode default embedding
- gui: model default opencode (opencode/openai/mock), eval default embedding
- world_studio CLI/GUI and WorldStudio: provider default opencode
- opencode_provider: model falls back to the Go default when NJE_OPENCODE_MODEL unset
  (still overridable; opencode models opencode-go lists available models)
- docs: README + both guides describe defaults and the opencode auth/serve steps
- tests/test_defaults.py (5); 176 tests
</commit_message>
<xml_diff>
--- a/docs/JazzWriter_新手引导.docx
+++ b/docs/JazzWriter_新手引导.docx
@@ -263,7 +263,7 @@
         <w:rPr>
           <w:b w:val="0"/>
         </w:rPr>
-        <w:t>说明：默认使用离线 mock 模型，无需任何 API Key 即可跑通流程（但内容偏模板化）。接入真实模型见第九章。</w:t>
+        <w:t>说明：**默认使用真实模型 opencode**（复用你已登录的模型，含 OpenCode Go 订阅），评价默认 embedding；离线时改用备选 mock。接入真实模型见第九章。</w:t>
       </w:r>
     </w:p>
     <w:p>
@@ -561,7 +561,7 @@
           </w:tcPr>
           <w:p>
             <w:r>
-              <w:t>mock（离线演示）/ opencode（复用你已连接的模型）/ openai（兼容端点）</w:t>
+              <w:t>opencode（默认，复用你已连接的模型）/ openai（兼容端点）/ mock（离线备选）</w:t>
             </w:r>
           </w:p>
         </w:tc>
@@ -583,7 +583,7 @@
           </w:tcPr>
           <w:p>
             <w:r>
-              <w:t>文本相似度算法：lexical（默认、无依赖）/ embedding / hybrid；改后点“重载设定”</w:t>
+              <w:t>文本相似度算法：embedding（默认，本地句向量）/ lexical / hybrid；改后点“重载设定”</w:t>
             </w:r>
           </w:p>
         </w:tc>
@@ -1933,7 +1933,7 @@
         <w:rPr>
           <w:b w:val="0"/>
         </w:rPr>
-        <w:t>默认 mock 只用于离线演示。要获得真正的创意与文笔，请接入真实模型（二者兼容）。</w:t>
+        <w:t>默认就走真实模型 opencode（复用你已登录的模型，含 OpenCode Go 订阅）；mock 是离线备选。</w:t>
       </w:r>
     </w:p>
     <w:p>
@@ -1941,7 +1941,7 @@
         <w:pStyle w:val="Heading2"/>
       </w:pPr>
       <w:r>
-        <w:t>方式一：opencode（复用你已连接的模型）</w:t>
+        <w:t>方式一：opencode（默认，推荐）</w:t>
       </w:r>
     </w:p>
     <w:p>
@@ -1949,7 +1949,7 @@
         <w:pStyle w:val="ListNumber"/>
       </w:pPr>
       <w:r>
-        <w:t>另开一个终端启动服务器：opencode serve --port 4096</w:t>
+        <w:t>一次性登录订阅：opencode auth login opencode（更新过 API key 后重做这一步即可）。</w:t>
       </w:r>
     </w:p>
     <w:p>
@@ -1957,7 +1957,7 @@
         <w:pStyle w:val="ListNumber"/>
       </w:pPr>
       <w:r>
-        <w:t>在 JazzWriter 顶部把“模型”下拉选 opencode，点“重载设定”。</w:t>
+        <w:t>另开一个终端启动服务器：opencode serve --port 4096（保持运行）。</w:t>
       </w:r>
     </w:p>
     <w:p>
@@ -1965,7 +1965,15 @@
         <w:pStyle w:val="ListNumber"/>
       </w:pPr>
       <w:r>
-        <w:t>可选环境变量：NJE_OPENCODE_URL（默认 http://127.0.0.1:4096）、NJE_OPENCODE_MODEL（如 anthropic/claude-…）。</w:t>
+        <w:t>直接使用：命令行无需 --provider；GUI 顶部“模型”默认已选 opencode，点“重载设定”。</w:t>
+      </w:r>
+    </w:p>
+    <w:p>
+      <w:pPr>
+        <w:pStyle w:val="ListNumber"/>
+      </w:pPr>
+      <w:r>
+        <w:t>默认模型为 opencode-go/deepseek-v4.1-flash；可用 $env:NJE_OPENCODE_MODEL = "opencode-go/&lt;模型&gt;" 覆盖（opencode models opencode-go 可列出可用模型）。</w:t>
       </w:r>
     </w:p>
     <w:p>
@@ -2029,7 +2037,7 @@
         <w:rPr>
           <w:b w:val="0"/>
         </w:rPr>
-        <w:t>提示：结构在离线（mock）下用确定性模板，会被标记为 offline_template；只有接入模型才是模型创作。</w:t>
+        <w:t>离线备选：把“模型”切到 mock（或 --provider mock），用确定性模板跑通流程，产出会标记为 offline_template。</w:t>
       </w:r>
     </w:p>
     <w:p>

</xml_diff>